<commit_message>
Update Google track info doc with latest version
Co-Authored-By: Claude Sonnet 5 <noreply@anthropic.com>
</commit_message>
<xml_diff>
--- a/google track info.docx
+++ b/google track info.docx
@@ -2,6 +2,27 @@
 <file path=word/document.xml><?xml version="1.0" encoding="utf-8"?>
 <w:document xmlns:mc="http://schemas.openxmlformats.org/markup-compatibility/2006" xmlns:o="urn:schemas-microsoft-com:office:office" xmlns:r="http://schemas.openxmlformats.org/officeDocument/2006/relationships" xmlns:m="http://schemas.openxmlformats.org/officeDocument/2006/math" xmlns:v="urn:schemas-microsoft-com:vml" xmlns:wp="http://schemas.openxmlformats.org/drawingml/2006/wordprocessingDrawing" xmlns:w10="urn:schemas-microsoft-com:office:word" xmlns:w="http://schemas.openxmlformats.org/wordprocessingml/2006/main" xmlns:wne="http://schemas.microsoft.com/office/word/2006/wordml" xmlns:sl="http://schemas.openxmlformats.org/schemaLibrary/2006/main" xmlns:a="http://schemas.openxmlformats.org/drawingml/2006/main" xmlns:pic="http://schemas.openxmlformats.org/drawingml/2006/picture" xmlns:c="http://schemas.openxmlformats.org/drawingml/2006/chart" xmlns:lc="http://schemas.openxmlformats.org/drawingml/2006/lockedCanvas" xmlns:dgm="http://schemas.openxmlformats.org/drawingml/2006/diagram" xmlns:wps="http://schemas.microsoft.com/office/word/2010/wordprocessingShape" xmlns:wpg="http://schemas.microsoft.com/office/word/2010/wordprocessingGroup" xmlns:w14="http://schemas.microsoft.com/office/word/2010/wordml" xmlns:w15="http://schemas.microsoft.com/office/word/2012/wordml" xmlns:w16="http://schemas.microsoft.com/office/word/2018/wordml" xmlns:w16cex="http://schemas.microsoft.com/office/word/2018/wordml/cex" xmlns:w16cid="http://schemas.microsoft.com/office/word/2016/wordml/cid" xmlns="http://schemas.microsoft.com/office/tasks/2019/documenttasks" xmlns:cr="http://schemas.microsoft.com/office/comments/2020/reactions">
   <w:body>
+    <w:p>
+      <w:pPr>
+        <w:rPr>
+          <w:b w:val="1"/>
+          <w:bCs w:val="1"/>
+        </w:rPr>
+      </w:pPr>
+      <w:r>
+        <w:rPr>
+          <w:sz w:val="18"/>
+          <w:szCs w:val="18"/>
+          <w:rtl w:val="0"/>
+        </w:rPr>
+        <w:t xml:space="preserve">We need to to talk about Gemma and how it works and how it can work for specific scenarios so that not all the thing is running on the most expensive model some use different models for different type of environment, environments or situations)</w:t>
+      </w:r>
+      <w:r>
+        <w:rPr>
+          <w:rtl w:val="0"/>
+        </w:rPr>
+      </w:r>
+    </w:p>
     <w:p>
       <w:pPr>
         <w:spacing w:after="240" w:before="240" w:lineRule="auto"/>

</xml_diff>